<commit_message>
finalize thesis consistency fixes and cleanup
</commit_message>
<xml_diff>
--- a/appendices/appendix_c_data_summary.docx
+++ b/appendices/appendix_c_data_summary.docx
@@ -186,7 +186,7 @@
                 <w:rFonts w:ascii="Times New Roman" w:hAnsi="Times New Roman"/>
                 <w:sz w:val="20"/>
               </w:rPr>
-              <w:t>0</w:t>
+              <w:t>5</w:t>
             </w:r>
           </w:p>
         </w:tc>
@@ -200,7 +200,7 @@
                 <w:rFonts w:ascii="Times New Roman" w:hAnsi="Times New Roman"/>
                 <w:sz w:val="20"/>
               </w:rPr>
-              <w:t>7</w:t>
+              <w:t>5</w:t>
             </w:r>
           </w:p>
         </w:tc>
@@ -242,7 +242,7 @@
                 <w:rFonts w:ascii="Times New Roman" w:hAnsi="Times New Roman"/>
                 <w:sz w:val="20"/>
               </w:rPr>
-              <w:t>39</w:t>
+              <w:t>36</w:t>
             </w:r>
           </w:p>
         </w:tc>
@@ -286,7 +286,7 @@
                 <w:rFonts w:ascii="Times New Roman" w:hAnsi="Times New Roman"/>
                 <w:sz w:val="20"/>
               </w:rPr>
-              <w:t>12</w:t>
+              <w:t>13</w:t>
             </w:r>
           </w:p>
         </w:tc>
@@ -300,7 +300,7 @@
                 <w:rFonts w:ascii="Times New Roman" w:hAnsi="Times New Roman"/>
                 <w:sz w:val="20"/>
               </w:rPr>
-              <w:t>19</w:t>
+              <w:t>16</w:t>
             </w:r>
           </w:p>
         </w:tc>
@@ -328,7 +328,7 @@
                 <w:rFonts w:ascii="Times New Roman" w:hAnsi="Times New Roman"/>
                 <w:sz w:val="20"/>
               </w:rPr>
-              <w:t>12</w:t>
+              <w:t>14</w:t>
             </w:r>
           </w:p>
         </w:tc>
@@ -372,7 +372,7 @@
                 <w:rFonts w:ascii="Times New Roman" w:hAnsi="Times New Roman"/>
                 <w:sz w:val="20"/>
               </w:rPr>
-              <w:t>7</w:t>
+              <w:t>6</w:t>
             </w:r>
           </w:p>
         </w:tc>
@@ -386,7 +386,7 @@
                 <w:rFonts w:ascii="Times New Roman" w:hAnsi="Times New Roman"/>
                 <w:sz w:val="20"/>
               </w:rPr>
-              <w:t>21</w:t>
+              <w:t>19</w:t>
             </w:r>
           </w:p>
         </w:tc>
@@ -530,7 +530,7 @@
                 <w:rFonts w:ascii="Times New Roman" w:hAnsi="Times New Roman"/>
                 <w:sz w:val="20"/>
               </w:rPr>
-              <w:t>14</w:t>
+              <w:t>19</w:t>
             </w:r>
           </w:p>
         </w:tc>
@@ -544,7 +544,7 @@
                 <w:rFonts w:ascii="Times New Roman" w:hAnsi="Times New Roman"/>
                 <w:sz w:val="20"/>
               </w:rPr>
-              <w:t>34</w:t>
+              <w:t>32</w:t>
             </w:r>
           </w:p>
         </w:tc>
@@ -558,7 +558,7 @@
                 <w:rFonts w:ascii="Times New Roman" w:hAnsi="Times New Roman"/>
                 <w:sz w:val="20"/>
               </w:rPr>
-              <w:t>43</w:t>
+              <w:t>38</w:t>
             </w:r>
           </w:p>
         </w:tc>
@@ -586,7 +586,7 @@
                 <w:rFonts w:ascii="Times New Roman" w:hAnsi="Times New Roman"/>
                 <w:sz w:val="20"/>
               </w:rPr>
-              <w:t>85</w:t>
+              <w:t>84</w:t>
             </w:r>
           </w:p>
         </w:tc>
@@ -830,7 +830,7 @@
                 <w:rFonts w:ascii="Times New Roman" w:hAnsi="Times New Roman"/>
                 <w:sz w:val="20"/>
               </w:rPr>
-              <w:t>48.70</w:t>
+              <w:t>47.02</w:t>
             </w:r>
           </w:p>
         </w:tc>
@@ -844,7 +844,7 @@
                 <w:rFonts w:ascii="Times New Roman" w:hAnsi="Times New Roman"/>
                 <w:sz w:val="20"/>
               </w:rPr>
-              <w:t>8.17</w:t>
+              <w:t>7.90</w:t>
             </w:r>
           </w:p>
         </w:tc>
@@ -858,7 +858,7 @@
                 <w:rFonts w:ascii="Times New Roman" w:hAnsi="Times New Roman"/>
                 <w:sz w:val="20"/>
               </w:rPr>
-              <w:t>48.0</w:t>
+              <w:t>48.5</w:t>
             </w:r>
           </w:p>
         </w:tc>
@@ -872,7 +872,7 @@
                 <w:rFonts w:ascii="Times New Roman" w:hAnsi="Times New Roman"/>
                 <w:sz w:val="20"/>
               </w:rPr>
-              <w:t>42.25</w:t>
+              <w:t>43.00</w:t>
             </w:r>
           </w:p>
         </w:tc>
@@ -886,7 +886,7 @@
                 <w:rFonts w:ascii="Times New Roman" w:hAnsi="Times New Roman"/>
                 <w:sz w:val="20"/>
               </w:rPr>
-              <w:t>55.00</w:t>
+              <w:t>52.75</w:t>
             </w:r>
           </w:p>
         </w:tc>
@@ -900,7 +900,7 @@
                 <w:rFonts w:ascii="Times New Roman" w:hAnsi="Times New Roman"/>
                 <w:sz w:val="20"/>
               </w:rPr>
-              <w:t>33</w:t>
+              <w:t>28</w:t>
             </w:r>
           </w:p>
         </w:tc>
@@ -914,7 +914,7 @@
                 <w:rFonts w:ascii="Times New Roman" w:hAnsi="Times New Roman"/>
                 <w:sz w:val="20"/>
               </w:rPr>
-              <w:t>65</w:t>
+              <w:t>64</w:t>
             </w:r>
           </w:p>
         </w:tc>
@@ -928,7 +928,7 @@
                 <w:rFonts w:ascii="Times New Roman" w:hAnsi="Times New Roman"/>
                 <w:sz w:val="20"/>
               </w:rPr>
-              <w:t>12.75</w:t>
+              <w:t>9.75</w:t>
             </w:r>
           </w:p>
         </w:tc>
@@ -972,7 +972,7 @@
                 <w:rFonts w:ascii="Times New Roman" w:hAnsi="Times New Roman"/>
                 <w:sz w:val="20"/>
               </w:rPr>
-              <w:t>40.36</w:t>
+              <w:t>42.88</w:t>
             </w:r>
           </w:p>
         </w:tc>
@@ -986,7 +986,7 @@
                 <w:rFonts w:ascii="Times New Roman" w:hAnsi="Times New Roman"/>
                 <w:sz w:val="20"/>
               </w:rPr>
-              <w:t>6.21</w:t>
+              <w:t>7.10</w:t>
             </w:r>
           </w:p>
         </w:tc>
@@ -1000,7 +1000,7 @@
                 <w:rFonts w:ascii="Times New Roman" w:hAnsi="Times New Roman"/>
                 <w:sz w:val="20"/>
               </w:rPr>
-              <w:t>39.0</w:t>
+              <w:t>42.0</w:t>
             </w:r>
           </w:p>
         </w:tc>
@@ -1014,7 +1014,7 @@
                 <w:rFonts w:ascii="Times New Roman" w:hAnsi="Times New Roman"/>
                 <w:sz w:val="20"/>
               </w:rPr>
-              <w:t>36.00</w:t>
+              <w:t>38.00</w:t>
             </w:r>
           </w:p>
         </w:tc>
@@ -1028,7 +1028,7 @@
                 <w:rFonts w:ascii="Times New Roman" w:hAnsi="Times New Roman"/>
                 <w:sz w:val="20"/>
               </w:rPr>
-              <w:t>42.75</w:t>
+              <w:t>47.00</w:t>
             </w:r>
           </w:p>
         </w:tc>
@@ -1042,7 +1042,7 @@
                 <w:rFonts w:ascii="Times New Roman" w:hAnsi="Times New Roman"/>
                 <w:sz w:val="20"/>
               </w:rPr>
-              <w:t>31</w:t>
+              <w:t>30</w:t>
             </w:r>
           </w:p>
         </w:tc>
@@ -1070,7 +1070,7 @@
                 <w:rFonts w:ascii="Times New Roman" w:hAnsi="Times New Roman"/>
                 <w:sz w:val="20"/>
               </w:rPr>
-              <w:t>6.75</w:t>
+              <w:t>9.00</w:t>
             </w:r>
           </w:p>
         </w:tc>
@@ -1100,7 +1100,7 @@
                 <w:rFonts w:ascii="Times New Roman" w:hAnsi="Times New Roman"/>
                 <w:sz w:val="20"/>
               </w:rPr>
-              <w:t>50</w:t>
+              <w:t>47</w:t>
             </w:r>
           </w:p>
         </w:tc>
@@ -1114,7 +1114,7 @@
                 <w:rFonts w:ascii="Times New Roman" w:hAnsi="Times New Roman"/>
                 <w:sz w:val="20"/>
               </w:rPr>
-              <w:t>32.38</w:t>
+              <w:t>35.64</w:t>
             </w:r>
           </w:p>
         </w:tc>
@@ -1128,7 +1128,7 @@
                 <w:rFonts w:ascii="Times New Roman" w:hAnsi="Times New Roman"/>
                 <w:sz w:val="20"/>
               </w:rPr>
-              <w:t>6.39</w:t>
+              <w:t>7.97</w:t>
             </w:r>
           </w:p>
         </w:tc>
@@ -1142,7 +1142,7 @@
                 <w:rFonts w:ascii="Times New Roman" w:hAnsi="Times New Roman"/>
                 <w:sz w:val="20"/>
               </w:rPr>
-              <w:t>31.0</w:t>
+              <w:t>35.0</w:t>
             </w:r>
           </w:p>
         </w:tc>
@@ -1156,7 +1156,7 @@
                 <w:rFonts w:ascii="Times New Roman" w:hAnsi="Times New Roman"/>
                 <w:sz w:val="20"/>
               </w:rPr>
-              <w:t>29.00</w:t>
+              <w:t>31.00</w:t>
             </w:r>
           </w:p>
         </w:tc>
@@ -1170,7 +1170,7 @@
                 <w:rFonts w:ascii="Times New Roman" w:hAnsi="Times New Roman"/>
                 <w:sz w:val="20"/>
               </w:rPr>
-              <w:t>37.00</w:t>
+              <w:t>39.00</w:t>
             </w:r>
           </w:p>
         </w:tc>
@@ -1184,7 +1184,7 @@
                 <w:rFonts w:ascii="Times New Roman" w:hAnsi="Times New Roman"/>
                 <w:sz w:val="20"/>
               </w:rPr>
-              <w:t>17</w:t>
+              <w:t>20</w:t>
             </w:r>
           </w:p>
         </w:tc>
@@ -1198,7 +1198,7 @@
                 <w:rFonts w:ascii="Times New Roman" w:hAnsi="Times New Roman"/>
                 <w:sz w:val="20"/>
               </w:rPr>
-              <w:t>45</w:t>
+              <w:t>57</w:t>
             </w:r>
           </w:p>
         </w:tc>
@@ -1256,7 +1256,7 @@
                 <w:rFonts w:ascii="Times New Roman" w:hAnsi="Times New Roman"/>
                 <w:sz w:val="20"/>
               </w:rPr>
-              <w:t>23.78</w:t>
+              <w:t>28.98</w:t>
             </w:r>
           </w:p>
         </w:tc>
@@ -1270,7 +1270,7 @@
                 <w:rFonts w:ascii="Times New Roman" w:hAnsi="Times New Roman"/>
                 <w:sz w:val="20"/>
               </w:rPr>
-              <w:t>5.83</w:t>
+              <w:t>6.82</w:t>
             </w:r>
           </w:p>
         </w:tc>
@@ -1284,7 +1284,7 @@
                 <w:rFonts w:ascii="Times New Roman" w:hAnsi="Times New Roman"/>
                 <w:sz w:val="20"/>
               </w:rPr>
-              <w:t>21.0</w:t>
+              <w:t>27.5</w:t>
             </w:r>
           </w:p>
         </w:tc>
@@ -1298,7 +1298,7 @@
                 <w:rFonts w:ascii="Times New Roman" w:hAnsi="Times New Roman"/>
                 <w:sz w:val="20"/>
               </w:rPr>
-              <w:t>18.25</w:t>
+              <w:t>25.00</w:t>
             </w:r>
           </w:p>
         </w:tc>
@@ -1312,7 +1312,7 @@
                 <w:rFonts w:ascii="Times New Roman" w:hAnsi="Times New Roman"/>
                 <w:sz w:val="20"/>
               </w:rPr>
-              <w:t>29.75</w:t>
+              <w:t>34.00</w:t>
             </w:r>
           </w:p>
         </w:tc>
@@ -1326,7 +1326,7 @@
                 <w:rFonts w:ascii="Times New Roman" w:hAnsi="Times New Roman"/>
                 <w:sz w:val="20"/>
               </w:rPr>
-              <w:t>16</w:t>
+              <w:t>17</w:t>
             </w:r>
           </w:p>
         </w:tc>
@@ -1340,7 +1340,7 @@
                 <w:rFonts w:ascii="Times New Roman" w:hAnsi="Times New Roman"/>
                 <w:sz w:val="20"/>
               </w:rPr>
-              <w:t>36</w:t>
+              <w:t>52</w:t>
             </w:r>
           </w:p>
         </w:tc>
@@ -1354,7 +1354,7 @@
                 <w:rFonts w:ascii="Times New Roman" w:hAnsi="Times New Roman"/>
                 <w:sz w:val="20"/>
               </w:rPr>
-              <w:t>11.50</w:t>
+              <w:t>9.00</w:t>
             </w:r>
           </w:p>
         </w:tc>
@@ -1384,7 +1384,7 @@
                 <w:rFonts w:ascii="Times New Roman" w:hAnsi="Times New Roman"/>
                 <w:sz w:val="20"/>
               </w:rPr>
-              <w:t>200</w:t>
+              <w:t>197</w:t>
             </w:r>
           </w:p>
         </w:tc>
@@ -1398,7 +1398,7 @@
                 <w:rFonts w:ascii="Times New Roman" w:hAnsi="Times New Roman"/>
                 <w:sz w:val="20"/>
               </w:rPr>
-              <w:t>36.30</w:t>
+              <w:t>38.68</w:t>
             </w:r>
           </w:p>
         </w:tc>
@@ -1412,7 +1412,7 @@
                 <w:rFonts w:ascii="Times New Roman" w:hAnsi="Times New Roman"/>
                 <w:sz w:val="20"/>
               </w:rPr>
-              <w:t>11.42</w:t>
+              <w:t>10.16</w:t>
             </w:r>
           </w:p>
         </w:tc>
@@ -1426,7 +1426,7 @@
                 <w:rFonts w:ascii="Times New Roman" w:hAnsi="Times New Roman"/>
                 <w:sz w:val="20"/>
               </w:rPr>
-              <w:t>35.5</w:t>
+              <w:t>38.0</w:t>
             </w:r>
           </w:p>
         </w:tc>
@@ -1468,7 +1468,7 @@
                 <w:rFonts w:ascii="Times New Roman" w:hAnsi="Times New Roman"/>
                 <w:sz w:val="20"/>
               </w:rPr>
-              <w:t>16</w:t>
+              <w:t>17</w:t>
             </w:r>
           </w:p>
         </w:tc>
@@ -1482,7 +1482,7 @@
                 <w:rFonts w:ascii="Times New Roman" w:hAnsi="Times New Roman"/>
                 <w:sz w:val="20"/>
               </w:rPr>
-              <w:t>65</w:t>
+              <w:t>64</w:t>
             </w:r>
           </w:p>
         </w:tc>
@@ -1676,21 +1676,7 @@
                 <w:rFonts w:ascii="Times New Roman" w:hAnsi="Times New Roman"/>
                 <w:sz w:val="20"/>
               </w:rPr>
-              <w:t>4 (8%)</w:t>
-            </w:r>
-          </w:p>
-        </w:tc>
-        <w:tc>
-          <w:tcPr>
-            <w:tcW w:type="dxa" w:w="1504"/>
-          </w:tcPr>
-          <w:p>
-            <w:r>
-              <w:rPr>
-                <w:rFonts w:ascii="Times New Roman" w:hAnsi="Times New Roman"/>
-                <w:sz w:val="20"/>
-              </w:rPr>
-              <w:t>23 (46%)</w:t>
+              <w:t>9 (18%)</w:t>
             </w:r>
           </w:p>
         </w:tc>
@@ -1705,6 +1691,20 @@
                 <w:sz w:val="20"/>
               </w:rPr>
               <w:t>22 (44%)</w:t>
+            </w:r>
+          </w:p>
+        </w:tc>
+        <w:tc>
+          <w:tcPr>
+            <w:tcW w:type="dxa" w:w="1504"/>
+          </w:tcPr>
+          <w:p>
+            <w:r>
+              <w:rPr>
+                <w:rFonts w:ascii="Times New Roman" w:hAnsi="Times New Roman"/>
+                <w:sz w:val="20"/>
+              </w:rPr>
+              <w:t>18 (36%)</w:t>
             </w:r>
           </w:p>
         </w:tc>
@@ -1762,7 +1762,7 @@
                 <w:rFonts w:ascii="Times New Roman" w:hAnsi="Times New Roman"/>
                 <w:sz w:val="20"/>
               </w:rPr>
-              <w:t>23 (46%)</w:t>
+              <w:t>16 (32%)</w:t>
             </w:r>
           </w:p>
         </w:tc>
@@ -1790,7 +1790,7 @@
                 <w:rFonts w:ascii="Times New Roman" w:hAnsi="Times New Roman"/>
                 <w:sz w:val="20"/>
               </w:rPr>
-              <w:t>3 (6%)</w:t>
+              <w:t>10 (20%)</w:t>
             </w:r>
           </w:p>
         </w:tc>
@@ -1834,7 +1834,7 @@
                 <w:rFonts w:ascii="Times New Roman" w:hAnsi="Times New Roman"/>
                 <w:sz w:val="20"/>
               </w:rPr>
-              <w:t>7 (14%)</w:t>
+              <w:t>6 (12.8%)</w:t>
             </w:r>
           </w:p>
         </w:tc>
@@ -1848,7 +1848,7 @@
                 <w:rFonts w:ascii="Times New Roman" w:hAnsi="Times New Roman"/>
                 <w:sz w:val="20"/>
               </w:rPr>
-              <w:t>35 (70%)</w:t>
+              <w:t>26 (55.3%)</w:t>
             </w:r>
           </w:p>
         </w:tc>
@@ -1862,7 +1862,7 @@
                 <w:rFonts w:ascii="Times New Roman" w:hAnsi="Times New Roman"/>
                 <w:sz w:val="20"/>
               </w:rPr>
-              <w:t>8 (16%)</w:t>
+              <w:t>13 (27.7%)</w:t>
             </w:r>
           </w:p>
         </w:tc>
@@ -1876,7 +1876,7 @@
                 <w:rFonts w:ascii="Times New Roman" w:hAnsi="Times New Roman"/>
                 <w:sz w:val="20"/>
               </w:rPr>
-              <w:t>0 (0%)</w:t>
+              <w:t>2 (4.3%)</w:t>
             </w:r>
           </w:p>
         </w:tc>
@@ -1920,7 +1920,7 @@
                 <w:rFonts w:ascii="Times New Roman" w:hAnsi="Times New Roman"/>
                 <w:sz w:val="20"/>
               </w:rPr>
-              <w:t>30 (60%)</w:t>
+              <w:t>21 (42%)</w:t>
             </w:r>
           </w:p>
         </w:tc>
@@ -1934,7 +1934,7 @@
                 <w:rFonts w:ascii="Times New Roman" w:hAnsi="Times New Roman"/>
                 <w:sz w:val="20"/>
               </w:rPr>
-              <w:t>20 (40%)</w:t>
+              <w:t>25 (50%)</w:t>
             </w:r>
           </w:p>
         </w:tc>
@@ -1948,7 +1948,7 @@
                 <w:rFonts w:ascii="Times New Roman" w:hAnsi="Times New Roman"/>
                 <w:sz w:val="20"/>
               </w:rPr>
-              <w:t>0 (0%)</w:t>
+              <w:t>3 (6%)</w:t>
             </w:r>
           </w:p>
         </w:tc>
@@ -1962,7 +1962,7 @@
                 <w:rFonts w:ascii="Times New Roman" w:hAnsi="Times New Roman"/>
                 <w:sz w:val="20"/>
               </w:rPr>
-              <w:t>0 (0%)</w:t>
+              <w:t>1 (2%)</w:t>
             </w:r>
           </w:p>
         </w:tc>
@@ -2314,7 +2314,7 @@
                 <w:rFonts w:ascii="Times New Roman" w:hAnsi="Times New Roman"/>
                 <w:sz w:val="20"/>
               </w:rPr>
-              <w:t>30%</w:t>
+              <w:t>29.8%</w:t>
             </w:r>
           </w:p>
         </w:tc>
@@ -2342,7 +2342,7 @@
                 <w:rFonts w:ascii="Times New Roman" w:hAnsi="Times New Roman"/>
                 <w:sz w:val="20"/>
               </w:rPr>
-              <w:t>14%</w:t>
+              <w:t>12.8%</w:t>
             </w:r>
           </w:p>
         </w:tc>
@@ -2370,7 +2370,7 @@
                 <w:rFonts w:ascii="Times New Roman" w:hAnsi="Times New Roman"/>
                 <w:sz w:val="20"/>
               </w:rPr>
-              <w:t>1.44</w:t>
+              <w:t>1.43</w:t>
             </w:r>
           </w:p>
         </w:tc>
@@ -2618,7 +2618,7 @@
                 <w:rFonts w:ascii="Times New Roman" w:hAnsi="Times New Roman"/>
                 <w:sz w:val="20"/>
               </w:rPr>
-              <w:t>1980</w:t>
+              <w:t>1646</w:t>
             </w:r>
           </w:p>
         </w:tc>
@@ -2632,7 +2632,7 @@
                 <w:rFonts w:ascii="Times New Roman" w:hAnsi="Times New Roman"/>
                 <w:sz w:val="20"/>
               </w:rPr>
-              <w:t>&lt;.0001</w:t>
+              <w:t>.0384</w:t>
             </w:r>
           </w:p>
         </w:tc>
@@ -2646,7 +2646,7 @@
                 <w:rFonts w:ascii="Times New Roman" w:hAnsi="Times New Roman"/>
                 <w:sz w:val="20"/>
               </w:rPr>
-              <w:t>−0.584</w:t>
+              <w:t>−0.316</w:t>
             </w:r>
           </w:p>
         </w:tc>
@@ -2660,7 +2660,7 @@
                 <w:rFonts w:ascii="Times New Roman" w:hAnsi="Times New Roman"/>
                 <w:sz w:val="20"/>
               </w:rPr>
-              <w:t>***</w:t>
+              <w:t>*</w:t>
             </w:r>
           </w:p>
         </w:tc>
@@ -2690,7 +2690,7 @@
                 <w:rFonts w:ascii="Times New Roman" w:hAnsi="Times New Roman"/>
                 <w:sz w:val="20"/>
               </w:rPr>
-              <w:t>2348</w:t>
+              <w:t>1972</w:t>
             </w:r>
           </w:p>
         </w:tc>
@@ -2718,7 +2718,7 @@
                 <w:rFonts w:ascii="Times New Roman" w:hAnsi="Times New Roman"/>
                 <w:sz w:val="20"/>
               </w:rPr>
-              <w:t>−0.878</w:t>
+              <w:t>−0.678</w:t>
             </w:r>
           </w:p>
         </w:tc>
@@ -2762,7 +2762,7 @@
                 <w:rFonts w:ascii="Times New Roman" w:hAnsi="Times New Roman"/>
                 <w:sz w:val="20"/>
               </w:rPr>
-              <w:t>2494</w:t>
+              <w:t>2364</w:t>
             </w:r>
           </w:p>
         </w:tc>
@@ -2790,7 +2790,7 @@
                 <w:rFonts w:ascii="Times New Roman" w:hAnsi="Times New Roman"/>
                 <w:sz w:val="20"/>
               </w:rPr>
-              <w:t>−0.995</w:t>
+              <w:t>−0.891</w:t>
             </w:r>
           </w:p>
         </w:tc>
@@ -2834,7 +2834,7 @@
                 <w:rFonts w:ascii="Times New Roman" w:hAnsi="Times New Roman"/>
                 <w:sz w:val="20"/>
               </w:rPr>
-              <w:t>2030</w:t>
+              <w:t>1775</w:t>
             </w:r>
           </w:p>
         </w:tc>
@@ -2848,7 +2848,7 @@
                 <w:rFonts w:ascii="Times New Roman" w:hAnsi="Times New Roman"/>
                 <w:sz w:val="20"/>
               </w:rPr>
-              <w:t>&lt;.0001</w:t>
+              <w:t>.0001</w:t>
             </w:r>
           </w:p>
         </w:tc>
@@ -2862,7 +2862,7 @@
                 <w:rFonts w:ascii="Times New Roman" w:hAnsi="Times New Roman"/>
                 <w:sz w:val="20"/>
               </w:rPr>
-              <w:t>−0.624</w:t>
+              <w:t>−0.511</w:t>
             </w:r>
           </w:p>
         </w:tc>
@@ -2906,7 +2906,7 @@
                 <w:rFonts w:ascii="Times New Roman" w:hAnsi="Times New Roman"/>
                 <w:sz w:val="20"/>
               </w:rPr>
-              <w:t>2468</w:t>
+              <w:t>2313</w:t>
             </w:r>
           </w:p>
         </w:tc>
@@ -2934,7 +2934,7 @@
                 <w:rFonts w:ascii="Times New Roman" w:hAnsi="Times New Roman"/>
                 <w:sz w:val="20"/>
               </w:rPr>
-              <w:t>−0.974</w:t>
+              <w:t>−0.850</w:t>
             </w:r>
           </w:p>
         </w:tc>
@@ -2978,7 +2978,7 @@
                 <w:rFonts w:ascii="Times New Roman" w:hAnsi="Times New Roman"/>
                 <w:sz w:val="20"/>
               </w:rPr>
-              <w:t>2051</w:t>
+              <w:t>1740</w:t>
             </w:r>
           </w:p>
         </w:tc>
@@ -2992,7 +2992,7 @@
                 <w:rFonts w:ascii="Times New Roman" w:hAnsi="Times New Roman"/>
                 <w:sz w:val="20"/>
               </w:rPr>
-              <w:t>&lt;.0001</w:t>
+              <w:t>.0003</w:t>
             </w:r>
           </w:p>
         </w:tc>
@@ -3006,7 +3006,7 @@
                 <w:rFonts w:ascii="Times New Roman" w:hAnsi="Times New Roman"/>
                 <w:sz w:val="20"/>
               </w:rPr>
-              <w:t>−0.641</w:t>
+              <w:t>−0.480</w:t>
             </w:r>
           </w:p>
         </w:tc>
@@ -3038,7 +3038,7 @@
           <w:i/>
           <w:sz w:val="24"/>
         </w:rPr>
-        <w:t>Note. *** p &lt; .001. Effect size r computed as Z / sqrt(N).</w:t>
+        <w:t>Note. * p &lt; .05, *** p &lt; .001. Effect size r reported as rank-biserial correlation.</w:t>
       </w:r>
     </w:p>
     <w:p>
@@ -3227,7 +3227,7 @@
                 <w:rFonts w:ascii="Times New Roman" w:hAnsi="Times New Roman"/>
                 <w:sz w:val="20"/>
               </w:rPr>
-              <w:t>63</w:t>
+              <w:t>97</w:t>
             </w:r>
           </w:p>
         </w:tc>
@@ -3241,7 +3241,7 @@
                 <w:rFonts w:ascii="Times New Roman" w:hAnsi="Times New Roman"/>
                 <w:sz w:val="20"/>
               </w:rPr>
-              <w:t>.017</w:t>
+              <w:t>−.044</w:t>
             </w:r>
           </w:p>
         </w:tc>
@@ -3255,7 +3255,7 @@
                 <w:rFonts w:ascii="Times New Roman" w:hAnsi="Times New Roman"/>
                 <w:sz w:val="20"/>
               </w:rPr>
-              <w:t>.894</w:t>
+              <w:t>.669</w:t>
             </w:r>
           </w:p>
         </w:tc>
@@ -3312,7 +3312,7 @@
                 <w:rFonts w:ascii="Times New Roman" w:hAnsi="Times New Roman"/>
                 <w:sz w:val="20"/>
               </w:rPr>
-              <w:t>121</w:t>
+              <w:t>147</w:t>
             </w:r>
           </w:p>
         </w:tc>
@@ -3326,7 +3326,7 @@
                 <w:rFonts w:ascii="Times New Roman" w:hAnsi="Times New Roman"/>
                 <w:sz w:val="20"/>
               </w:rPr>
-              <w:t>.549</w:t>
+              <w:t>.284</w:t>
             </w:r>
           </w:p>
         </w:tc>
@@ -3398,7 +3398,7 @@
                 <w:rFonts w:ascii="Times New Roman" w:hAnsi="Times New Roman"/>
                 <w:sz w:val="20"/>
               </w:rPr>
-              <w:t>111</w:t>
+              <w:t>147</w:t>
             </w:r>
           </w:p>
         </w:tc>
@@ -3412,7 +3412,7 @@
                 <w:rFonts w:ascii="Times New Roman" w:hAnsi="Times New Roman"/>
                 <w:sz w:val="20"/>
               </w:rPr>
-              <w:t>.520</w:t>
+              <w:t>.371</w:t>
             </w:r>
           </w:p>
         </w:tc>
@@ -3484,7 +3484,7 @@
                 <w:rFonts w:ascii="Times New Roman" w:hAnsi="Times New Roman"/>
                 <w:sz w:val="20"/>
               </w:rPr>
-              <w:t>—</w:t>
+              <w:t>50</w:t>
             </w:r>
           </w:p>
         </w:tc>
@@ -3498,7 +3498,7 @@
                 <w:rFonts w:ascii="Times New Roman" w:hAnsi="Times New Roman"/>
                 <w:sz w:val="20"/>
               </w:rPr>
-              <w:t>−.352</w:t>
+              <w:t>−.340</w:t>
             </w:r>
           </w:p>
         </w:tc>
@@ -3512,7 +3512,7 @@
                 <w:rFonts w:ascii="Times New Roman" w:hAnsi="Times New Roman"/>
                 <w:sz w:val="20"/>
               </w:rPr>
-              <w:t>.018</w:t>
+              <w:t>.016</w:t>
             </w:r>
           </w:p>
         </w:tc>
@@ -3570,7 +3570,7 @@
                 <w:rFonts w:ascii="Times New Roman" w:hAnsi="Times New Roman"/>
                 <w:sz w:val="20"/>
               </w:rPr>
-              <w:t>—</w:t>
+              <w:t>50</w:t>
             </w:r>
           </w:p>
         </w:tc>
@@ -3584,7 +3584,7 @@
                 <w:rFonts w:ascii="Times New Roman" w:hAnsi="Times New Roman"/>
                 <w:sz w:val="20"/>
               </w:rPr>
-              <w:t>−.338</w:t>
+              <w:t>−.286</w:t>
             </w:r>
           </w:p>
         </w:tc>
@@ -3598,7 +3598,7 @@
                 <w:rFonts w:ascii="Times New Roman" w:hAnsi="Times New Roman"/>
                 <w:sz w:val="20"/>
               </w:rPr>
-              <w:t>.023</w:t>
+              <w:t>.044</w:t>
             </w:r>
           </w:p>
         </w:tc>
@@ -3656,7 +3656,7 @@
                 <w:rFonts w:ascii="Times New Roman" w:hAnsi="Times New Roman"/>
                 <w:sz w:val="20"/>
               </w:rPr>
-              <w:t>—</w:t>
+              <w:t>50</w:t>
             </w:r>
           </w:p>
         </w:tc>
@@ -3670,7 +3670,7 @@
                 <w:rFonts w:ascii="Times New Roman" w:hAnsi="Times New Roman"/>
                 <w:sz w:val="20"/>
               </w:rPr>
-              <w:t>−.239</w:t>
+              <w:t>−.178</w:t>
             </w:r>
           </w:p>
         </w:tc>
@@ -3684,7 +3684,7 @@
                 <w:rFonts w:ascii="Times New Roman" w:hAnsi="Times New Roman"/>
                 <w:sz w:val="20"/>
               </w:rPr>
-              <w:t>.127</w:t>
+              <w:t>.216</w:t>
             </w:r>
           </w:p>
         </w:tc>
@@ -3741,7 +3741,7 @@
                 <w:rFonts w:ascii="Times New Roman" w:hAnsi="Times New Roman"/>
                 <w:sz w:val="20"/>
               </w:rPr>
-              <w:t>—</w:t>
+              <w:t>47</w:t>
             </w:r>
           </w:p>
         </w:tc>
@@ -3755,7 +3755,7 @@
                 <w:rFonts w:ascii="Times New Roman" w:hAnsi="Times New Roman"/>
                 <w:sz w:val="20"/>
               </w:rPr>
-              <w:t>.522</w:t>
+              <w:t>−.057</w:t>
             </w:r>
           </w:p>
         </w:tc>
@@ -3769,7 +3769,7 @@
                 <w:rFonts w:ascii="Times New Roman" w:hAnsi="Times New Roman"/>
                 <w:sz w:val="20"/>
               </w:rPr>
-              <w:t>.026</w:t>
+              <w:t>.702</w:t>
             </w:r>
           </w:p>
         </w:tc>
@@ -3783,7 +3783,6 @@
                 <w:rFonts w:ascii="Times New Roman" w:hAnsi="Times New Roman"/>
                 <w:sz w:val="20"/>
               </w:rPr>
-              <w:t>*</w:t>
             </w:r>
           </w:p>
         </w:tc>
@@ -3827,7 +3826,7 @@
                 <w:rFonts w:ascii="Times New Roman" w:hAnsi="Times New Roman"/>
                 <w:sz w:val="20"/>
               </w:rPr>
-              <w:t>—</w:t>
+              <w:t>47</w:t>
             </w:r>
           </w:p>
         </w:tc>
@@ -3841,7 +3840,7 @@
                 <w:rFonts w:ascii="Times New Roman" w:hAnsi="Times New Roman"/>
                 <w:sz w:val="20"/>
               </w:rPr>
-              <w:t>.475</w:t>
+              <w:t>.109</w:t>
             </w:r>
           </w:p>
         </w:tc>
@@ -3855,7 +3854,7 @@
                 <w:rFonts w:ascii="Times New Roman" w:hAnsi="Times New Roman"/>
                 <w:sz w:val="20"/>
               </w:rPr>
-              <w:t>.003</w:t>
+              <w:t>.467</w:t>
             </w:r>
           </w:p>
         </w:tc>
@@ -3869,7 +3868,6 @@
                 <w:rFonts w:ascii="Times New Roman" w:hAnsi="Times New Roman"/>
                 <w:sz w:val="20"/>
               </w:rPr>
-              <w:t>**</w:t>
             </w:r>
           </w:p>
         </w:tc>
@@ -3913,7 +3911,7 @@
                 <w:rFonts w:ascii="Times New Roman" w:hAnsi="Times New Roman"/>
                 <w:sz w:val="20"/>
               </w:rPr>
-              <w:t>—</w:t>
+              <w:t>47</w:t>
             </w:r>
           </w:p>
         </w:tc>
@@ -3927,7 +3925,7 @@
                 <w:rFonts w:ascii="Times New Roman" w:hAnsi="Times New Roman"/>
                 <w:sz w:val="20"/>
               </w:rPr>
-              <w:t>.262</w:t>
+              <w:t>.124</w:t>
             </w:r>
           </w:p>
         </w:tc>
@@ -3941,7 +3939,7 @@
                 <w:rFonts w:ascii="Times New Roman" w:hAnsi="Times New Roman"/>
                 <w:sz w:val="20"/>
               </w:rPr>
-              <w:t>.094</w:t>
+              <w:t>.408</w:t>
             </w:r>
           </w:p>
         </w:tc>
@@ -3998,7 +3996,7 @@
                 <w:rFonts w:ascii="Times New Roman" w:hAnsi="Times New Roman"/>
                 <w:sz w:val="20"/>
               </w:rPr>
-              <w:t>—</w:t>
+              <w:t>50</w:t>
             </w:r>
           </w:p>
         </w:tc>
@@ -4012,7 +4010,7 @@
                 <w:rFonts w:ascii="Times New Roman" w:hAnsi="Times New Roman"/>
                 <w:sz w:val="20"/>
               </w:rPr>
-              <w:t>−.038</w:t>
+              <w:t>−.174</w:t>
             </w:r>
           </w:p>
         </w:tc>
@@ -4026,7 +4024,7 @@
                 <w:rFonts w:ascii="Times New Roman" w:hAnsi="Times New Roman"/>
                 <w:sz w:val="20"/>
               </w:rPr>
-              <w:t>.817</w:t>
+              <w:t>.226</w:t>
             </w:r>
           </w:p>
         </w:tc>
@@ -4083,7 +4081,7 @@
                 <w:rFonts w:ascii="Times New Roman" w:hAnsi="Times New Roman"/>
                 <w:sz w:val="20"/>
               </w:rPr>
-              <w:t>—</w:t>
+              <w:t>50</w:t>
             </w:r>
           </w:p>
         </w:tc>
@@ -4097,7 +4095,7 @@
                 <w:rFonts w:ascii="Times New Roman" w:hAnsi="Times New Roman"/>
                 <w:sz w:val="20"/>
               </w:rPr>
-              <w:t>.065</w:t>
+              <w:t>−.045</w:t>
             </w:r>
           </w:p>
         </w:tc>
@@ -4111,7 +4109,7 @@
                 <w:rFonts w:ascii="Times New Roman" w:hAnsi="Times New Roman"/>
                 <w:sz w:val="20"/>
               </w:rPr>
-              <w:t>.747</w:t>
+              <w:t>.758</w:t>
             </w:r>
           </w:p>
         </w:tc>
@@ -4142,7 +4140,7 @@
           <w:i/>
           <w:sz w:val="24"/>
         </w:rPr>
-        <w:t>Note. * p &lt; .05, ** p &lt; .01, *** p &lt; .001.</w:t>
+        <w:t>Note. * p &lt; .05, *** p &lt; .001. Overall likes and comments correlations should be interpreted cautiously because they are confounded by between-platform differences.</w:t>
       </w:r>
     </w:p>
     <w:sectPr>

</xml_diff>

<commit_message>
add search-term appendix table and jama sensitivity note
</commit_message>
<xml_diff>
--- a/appendices/appendix_c_data_summary.docx
+++ b/appendices/appendix_c_data_summary.docx
@@ -6117,6 +6117,972 @@
         </w:tc>
       </w:tr>
     </w:tbl>
+    <w:p>
+      <w:pPr>
+        <w:spacing w:line="360" w:lineRule="auto" w:after="120" w:before="0"/>
+        <w:jc w:val="both"/>
+      </w:pPr>
+      <w:r>
+        <w:rPr>
+          <w:rFonts w:ascii="Times New Roman" w:hAnsi="Times New Roman" w:cs="Times New Roman"/>
+          <w:b w:val="0"/>
+          <w:i w:val="0"/>
+          <w:color w:val="000000"/>
+          <w:sz w:val="24"/>
+        </w:rPr>
+      </w:r>
+    </w:p>
+    <w:p>
+      <w:pPr>
+        <w:pStyle w:val="Heading2"/>
+        <w:spacing w:line="360" w:lineRule="auto" w:after="200" w:before="0"/>
+        <w:jc w:val="both"/>
+      </w:pPr>
+      <w:r>
+        <w:rPr>
+          <w:rFonts w:ascii="Times New Roman" w:hAnsi="Times New Roman" w:cs="Times New Roman"/>
+          <w:b/>
+          <w:i w:val="0"/>
+          <w:color w:val="000000"/>
+          <w:sz w:val="26"/>
+        </w:rPr>
+        <w:t>Table C10. DISCERN Total Scores by Search Term</w:t>
+      </w:r>
+    </w:p>
+    <w:tbl>
+      <w:tblPr>
+        <w:tblStyle w:val="TableGrid"/>
+        <w:tblW w:type="auto" w:w="0"/>
+        <w:jc w:val="center"/>
+        <w:tblLook w:firstColumn="1" w:firstRow="1" w:lastColumn="0" w:lastRow="0" w:noHBand="0" w:noVBand="1" w:val="04A0"/>
+      </w:tblPr>
+      <w:tblGrid>
+        <w:gridCol w:w="1289"/>
+        <w:gridCol w:w="1289"/>
+        <w:gridCol w:w="1289"/>
+        <w:gridCol w:w="1289"/>
+        <w:gridCol w:w="1289"/>
+        <w:gridCol w:w="1289"/>
+        <w:gridCol w:w="1289"/>
+      </w:tblGrid>
+      <w:tr>
+        <w:tc>
+          <w:tcPr>
+            <w:tcW w:type="dxa" w:w="1289"/>
+            <w:shd w:fill="D9E2F3" w:val="clear"/>
+          </w:tcPr>
+          <w:p>
+            <w:pPr>
+              <w:spacing w:line="240" w:lineRule="auto" w:after="40" w:before="0"/>
+              <w:jc w:val="center"/>
+            </w:pPr>
+            <w:r>
+              <w:rPr>
+                <w:rFonts w:ascii="Times New Roman" w:hAnsi="Times New Roman" w:cs="Times New Roman"/>
+                <w:b/>
+                <w:i w:val="0"/>
+                <w:color w:val="000000"/>
+                <w:sz w:val="20"/>
+              </w:rPr>
+              <w:t>Search Term</w:t>
+            </w:r>
+          </w:p>
+        </w:tc>
+        <w:tc>
+          <w:tcPr>
+            <w:tcW w:type="dxa" w:w="1289"/>
+            <w:shd w:fill="D9E2F3" w:val="clear"/>
+          </w:tcPr>
+          <w:p>
+            <w:pPr>
+              <w:spacing w:line="240" w:lineRule="auto" w:after="40" w:before="0"/>
+              <w:jc w:val="center"/>
+            </w:pPr>
+            <w:r>
+              <w:rPr>
+                <w:rFonts w:ascii="Times New Roman" w:hAnsi="Times New Roman" w:cs="Times New Roman"/>
+                <w:b/>
+                <w:i w:val="0"/>
+                <w:color w:val="000000"/>
+                <w:sz w:val="20"/>
+              </w:rPr>
+              <w:t>n</w:t>
+            </w:r>
+          </w:p>
+        </w:tc>
+        <w:tc>
+          <w:tcPr>
+            <w:tcW w:type="dxa" w:w="1289"/>
+            <w:shd w:fill="D9E2F3" w:val="clear"/>
+          </w:tcPr>
+          <w:p>
+            <w:pPr>
+              <w:spacing w:line="240" w:lineRule="auto" w:after="40" w:before="0"/>
+              <w:jc w:val="center"/>
+            </w:pPr>
+            <w:r>
+              <w:rPr>
+                <w:rFonts w:ascii="Times New Roman" w:hAnsi="Times New Roman" w:cs="Times New Roman"/>
+                <w:b/>
+                <w:i w:val="0"/>
+                <w:color w:val="000000"/>
+                <w:sz w:val="20"/>
+              </w:rPr>
+              <w:t>Mdn</w:t>
+            </w:r>
+          </w:p>
+        </w:tc>
+        <w:tc>
+          <w:tcPr>
+            <w:tcW w:type="dxa" w:w="1289"/>
+            <w:shd w:fill="D9E2F3" w:val="clear"/>
+          </w:tcPr>
+          <w:p>
+            <w:pPr>
+              <w:spacing w:line="240" w:lineRule="auto" w:after="40" w:before="0"/>
+              <w:jc w:val="center"/>
+            </w:pPr>
+            <w:r>
+              <w:rPr>
+                <w:rFonts w:ascii="Times New Roman" w:hAnsi="Times New Roman" w:cs="Times New Roman"/>
+                <w:b/>
+                <w:i w:val="0"/>
+                <w:color w:val="000000"/>
+                <w:sz w:val="20"/>
+              </w:rPr>
+              <w:t>Q1</w:t>
+            </w:r>
+          </w:p>
+        </w:tc>
+        <w:tc>
+          <w:tcPr>
+            <w:tcW w:type="dxa" w:w="1289"/>
+            <w:shd w:fill="D9E2F3" w:val="clear"/>
+          </w:tcPr>
+          <w:p>
+            <w:pPr>
+              <w:spacing w:line="240" w:lineRule="auto" w:after="40" w:before="0"/>
+              <w:jc w:val="center"/>
+            </w:pPr>
+            <w:r>
+              <w:rPr>
+                <w:rFonts w:ascii="Times New Roman" w:hAnsi="Times New Roman" w:cs="Times New Roman"/>
+                <w:b/>
+                <w:i w:val="0"/>
+                <w:color w:val="000000"/>
+                <w:sz w:val="20"/>
+              </w:rPr>
+              <w:t>Q3</w:t>
+            </w:r>
+          </w:p>
+        </w:tc>
+        <w:tc>
+          <w:tcPr>
+            <w:tcW w:type="dxa" w:w="1289"/>
+            <w:shd w:fill="D9E2F3" w:val="clear"/>
+          </w:tcPr>
+          <w:p>
+            <w:pPr>
+              <w:spacing w:line="240" w:lineRule="auto" w:after="40" w:before="0"/>
+              <w:jc w:val="center"/>
+            </w:pPr>
+            <w:r>
+              <w:rPr>
+                <w:rFonts w:ascii="Times New Roman" w:hAnsi="Times New Roman" w:cs="Times New Roman"/>
+                <w:b/>
+                <w:i w:val="0"/>
+                <w:color w:val="000000"/>
+                <w:sz w:val="20"/>
+              </w:rPr>
+              <w:t>M</w:t>
+            </w:r>
+          </w:p>
+        </w:tc>
+        <w:tc>
+          <w:tcPr>
+            <w:tcW w:type="dxa" w:w="1289"/>
+            <w:shd w:fill="D9E2F3" w:val="clear"/>
+          </w:tcPr>
+          <w:p>
+            <w:pPr>
+              <w:spacing w:line="240" w:lineRule="auto" w:after="40" w:before="0"/>
+              <w:jc w:val="center"/>
+            </w:pPr>
+            <w:r>
+              <w:rPr>
+                <w:rFonts w:ascii="Times New Roman" w:hAnsi="Times New Roman" w:cs="Times New Roman"/>
+                <w:b/>
+                <w:i w:val="0"/>
+                <w:color w:val="000000"/>
+                <w:sz w:val="20"/>
+              </w:rPr>
+              <w:t>SD</w:t>
+            </w:r>
+          </w:p>
+        </w:tc>
+      </w:tr>
+      <w:tr>
+        <w:tc>
+          <w:tcPr>
+            <w:tcW w:type="dxa" w:w="1289"/>
+          </w:tcPr>
+          <w:p>
+            <w:pPr>
+              <w:spacing w:line="240" w:lineRule="auto" w:after="40" w:before="0"/>
+              <w:jc w:val="center"/>
+            </w:pPr>
+            <w:r>
+              <w:rPr>
+                <w:rFonts w:ascii="Times New Roman" w:hAnsi="Times New Roman" w:cs="Times New Roman"/>
+                <w:b w:val="0"/>
+                <w:i w:val="0"/>
+                <w:color w:val="000000"/>
+                <w:sz w:val="20"/>
+              </w:rPr>
+              <w:t>How to start exercising</w:t>
+            </w:r>
+          </w:p>
+        </w:tc>
+        <w:tc>
+          <w:tcPr>
+            <w:tcW w:type="dxa" w:w="1289"/>
+          </w:tcPr>
+          <w:p>
+            <w:pPr>
+              <w:spacing w:line="240" w:lineRule="auto" w:after="40" w:before="0"/>
+              <w:jc w:val="center"/>
+            </w:pPr>
+            <w:r>
+              <w:rPr>
+                <w:rFonts w:ascii="Times New Roman" w:hAnsi="Times New Roman" w:cs="Times New Roman"/>
+                <w:b w:val="0"/>
+                <w:i w:val="0"/>
+                <w:color w:val="000000"/>
+                <w:sz w:val="20"/>
+              </w:rPr>
+              <w:t>40</w:t>
+            </w:r>
+          </w:p>
+        </w:tc>
+        <w:tc>
+          <w:tcPr>
+            <w:tcW w:type="dxa" w:w="1289"/>
+          </w:tcPr>
+          <w:p>
+            <w:pPr>
+              <w:spacing w:line="240" w:lineRule="auto" w:after="40" w:before="0"/>
+              <w:jc w:val="center"/>
+            </w:pPr>
+            <w:r>
+              <w:rPr>
+                <w:rFonts w:ascii="Times New Roman" w:hAnsi="Times New Roman" w:cs="Times New Roman"/>
+                <w:b w:val="0"/>
+                <w:i w:val="0"/>
+                <w:color w:val="000000"/>
+                <w:sz w:val="20"/>
+              </w:rPr>
+              <w:t>46.0</w:t>
+            </w:r>
+          </w:p>
+        </w:tc>
+        <w:tc>
+          <w:tcPr>
+            <w:tcW w:type="dxa" w:w="1289"/>
+          </w:tcPr>
+          <w:p>
+            <w:pPr>
+              <w:spacing w:line="240" w:lineRule="auto" w:after="40" w:before="0"/>
+              <w:jc w:val="center"/>
+            </w:pPr>
+            <w:r>
+              <w:rPr>
+                <w:rFonts w:ascii="Times New Roman" w:hAnsi="Times New Roman" w:cs="Times New Roman"/>
+                <w:b w:val="0"/>
+                <w:i w:val="0"/>
+                <w:color w:val="000000"/>
+                <w:sz w:val="20"/>
+              </w:rPr>
+              <w:t>37.75</w:t>
+            </w:r>
+          </w:p>
+        </w:tc>
+        <w:tc>
+          <w:tcPr>
+            <w:tcW w:type="dxa" w:w="1289"/>
+          </w:tcPr>
+          <w:p>
+            <w:pPr>
+              <w:spacing w:line="240" w:lineRule="auto" w:after="40" w:before="0"/>
+              <w:jc w:val="center"/>
+            </w:pPr>
+            <w:r>
+              <w:rPr>
+                <w:rFonts w:ascii="Times New Roman" w:hAnsi="Times New Roman" w:cs="Times New Roman"/>
+                <w:b w:val="0"/>
+                <w:i w:val="0"/>
+                <w:color w:val="000000"/>
+                <w:sz w:val="20"/>
+              </w:rPr>
+              <w:t>51.25</w:t>
+            </w:r>
+          </w:p>
+        </w:tc>
+        <w:tc>
+          <w:tcPr>
+            <w:tcW w:type="dxa" w:w="1289"/>
+          </w:tcPr>
+          <w:p>
+            <w:pPr>
+              <w:spacing w:line="240" w:lineRule="auto" w:after="40" w:before="0"/>
+              <w:jc w:val="center"/>
+            </w:pPr>
+            <w:r>
+              <w:rPr>
+                <w:rFonts w:ascii="Times New Roman" w:hAnsi="Times New Roman" w:cs="Times New Roman"/>
+                <w:b w:val="0"/>
+                <w:i w:val="0"/>
+                <w:color w:val="000000"/>
+                <w:sz w:val="20"/>
+              </w:rPr>
+              <w:t>43.83</w:t>
+            </w:r>
+          </w:p>
+        </w:tc>
+        <w:tc>
+          <w:tcPr>
+            <w:tcW w:type="dxa" w:w="1289"/>
+          </w:tcPr>
+          <w:p>
+            <w:pPr>
+              <w:spacing w:line="240" w:lineRule="auto" w:after="40" w:before="0"/>
+              <w:jc w:val="center"/>
+            </w:pPr>
+            <w:r>
+              <w:rPr>
+                <w:rFonts w:ascii="Times New Roman" w:hAnsi="Times New Roman" w:cs="Times New Roman"/>
+                <w:b w:val="0"/>
+                <w:i w:val="0"/>
+                <w:color w:val="000000"/>
+                <w:sz w:val="20"/>
+              </w:rPr>
+              <w:t>9.15</w:t>
+            </w:r>
+          </w:p>
+        </w:tc>
+      </w:tr>
+      <w:tr>
+        <w:tc>
+          <w:tcPr>
+            <w:tcW w:type="dxa" w:w="1289"/>
+          </w:tcPr>
+          <w:p>
+            <w:pPr>
+              <w:spacing w:line="240" w:lineRule="auto" w:after="40" w:before="0"/>
+              <w:jc w:val="center"/>
+            </w:pPr>
+            <w:r>
+              <w:rPr>
+                <w:rFonts w:ascii="Times New Roman" w:hAnsi="Times New Roman" w:cs="Times New Roman"/>
+                <w:b w:val="0"/>
+                <w:i w:val="0"/>
+                <w:color w:val="000000"/>
+                <w:sz w:val="20"/>
+              </w:rPr>
+              <w:t>Best exercises to lose weight</w:t>
+            </w:r>
+          </w:p>
+        </w:tc>
+        <w:tc>
+          <w:tcPr>
+            <w:tcW w:type="dxa" w:w="1289"/>
+          </w:tcPr>
+          <w:p>
+            <w:pPr>
+              <w:spacing w:line="240" w:lineRule="auto" w:after="40" w:before="0"/>
+              <w:jc w:val="center"/>
+            </w:pPr>
+            <w:r>
+              <w:rPr>
+                <w:rFonts w:ascii="Times New Roman" w:hAnsi="Times New Roman" w:cs="Times New Roman"/>
+                <w:b w:val="0"/>
+                <w:i w:val="0"/>
+                <w:color w:val="000000"/>
+                <w:sz w:val="20"/>
+              </w:rPr>
+              <w:t>40</w:t>
+            </w:r>
+          </w:p>
+        </w:tc>
+        <w:tc>
+          <w:tcPr>
+            <w:tcW w:type="dxa" w:w="1289"/>
+          </w:tcPr>
+          <w:p>
+            <w:pPr>
+              <w:spacing w:line="240" w:lineRule="auto" w:after="40" w:before="0"/>
+              <w:jc w:val="center"/>
+            </w:pPr>
+            <w:r>
+              <w:rPr>
+                <w:rFonts w:ascii="Times New Roman" w:hAnsi="Times New Roman" w:cs="Times New Roman"/>
+                <w:b w:val="0"/>
+                <w:i w:val="0"/>
+                <w:color w:val="000000"/>
+                <w:sz w:val="20"/>
+              </w:rPr>
+              <w:t>37.0</w:t>
+            </w:r>
+          </w:p>
+        </w:tc>
+        <w:tc>
+          <w:tcPr>
+            <w:tcW w:type="dxa" w:w="1289"/>
+          </w:tcPr>
+          <w:p>
+            <w:pPr>
+              <w:spacing w:line="240" w:lineRule="auto" w:after="40" w:before="0"/>
+              <w:jc w:val="center"/>
+            </w:pPr>
+            <w:r>
+              <w:rPr>
+                <w:rFonts w:ascii="Times New Roman" w:hAnsi="Times New Roman" w:cs="Times New Roman"/>
+                <w:b w:val="0"/>
+                <w:i w:val="0"/>
+                <w:color w:val="000000"/>
+                <w:sz w:val="20"/>
+              </w:rPr>
+              <w:t>28.75</w:t>
+            </w:r>
+          </w:p>
+        </w:tc>
+        <w:tc>
+          <w:tcPr>
+            <w:tcW w:type="dxa" w:w="1289"/>
+          </w:tcPr>
+          <w:p>
+            <w:pPr>
+              <w:spacing w:line="240" w:lineRule="auto" w:after="40" w:before="0"/>
+              <w:jc w:val="center"/>
+            </w:pPr>
+            <w:r>
+              <w:rPr>
+                <w:rFonts w:ascii="Times New Roman" w:hAnsi="Times New Roman" w:cs="Times New Roman"/>
+                <w:b w:val="0"/>
+                <w:i w:val="0"/>
+                <w:color w:val="000000"/>
+                <w:sz w:val="20"/>
+              </w:rPr>
+              <w:t>45.00</w:t>
+            </w:r>
+          </w:p>
+        </w:tc>
+        <w:tc>
+          <w:tcPr>
+            <w:tcW w:type="dxa" w:w="1289"/>
+          </w:tcPr>
+          <w:p>
+            <w:pPr>
+              <w:spacing w:line="240" w:lineRule="auto" w:after="40" w:before="0"/>
+              <w:jc w:val="center"/>
+            </w:pPr>
+            <w:r>
+              <w:rPr>
+                <w:rFonts w:ascii="Times New Roman" w:hAnsi="Times New Roman" w:cs="Times New Roman"/>
+                <w:b w:val="0"/>
+                <w:i w:val="0"/>
+                <w:color w:val="000000"/>
+                <w:sz w:val="20"/>
+              </w:rPr>
+              <w:t>36.70</w:t>
+            </w:r>
+          </w:p>
+        </w:tc>
+        <w:tc>
+          <w:tcPr>
+            <w:tcW w:type="dxa" w:w="1289"/>
+          </w:tcPr>
+          <w:p>
+            <w:pPr>
+              <w:spacing w:line="240" w:lineRule="auto" w:after="40" w:before="0"/>
+              <w:jc w:val="center"/>
+            </w:pPr>
+            <w:r>
+              <w:rPr>
+                <w:rFonts w:ascii="Times New Roman" w:hAnsi="Times New Roman" w:cs="Times New Roman"/>
+                <w:b w:val="0"/>
+                <w:i w:val="0"/>
+                <w:color w:val="000000"/>
+                <w:sz w:val="20"/>
+              </w:rPr>
+              <w:t>9.47</w:t>
+            </w:r>
+          </w:p>
+        </w:tc>
+      </w:tr>
+      <w:tr>
+        <w:tc>
+          <w:tcPr>
+            <w:tcW w:type="dxa" w:w="1289"/>
+          </w:tcPr>
+          <w:p>
+            <w:pPr>
+              <w:spacing w:line="240" w:lineRule="auto" w:after="40" w:before="0"/>
+              <w:jc w:val="center"/>
+            </w:pPr>
+            <w:r>
+              <w:rPr>
+                <w:rFonts w:ascii="Times New Roman" w:hAnsi="Times New Roman" w:cs="Times New Roman"/>
+                <w:b w:val="0"/>
+                <w:i w:val="0"/>
+                <w:color w:val="000000"/>
+                <w:sz w:val="20"/>
+              </w:rPr>
+              <w:t>Strength training for beginners</w:t>
+            </w:r>
+          </w:p>
+        </w:tc>
+        <w:tc>
+          <w:tcPr>
+            <w:tcW w:type="dxa" w:w="1289"/>
+          </w:tcPr>
+          <w:p>
+            <w:pPr>
+              <w:spacing w:line="240" w:lineRule="auto" w:after="40" w:before="0"/>
+              <w:jc w:val="center"/>
+            </w:pPr>
+            <w:r>
+              <w:rPr>
+                <w:rFonts w:ascii="Times New Roman" w:hAnsi="Times New Roman" w:cs="Times New Roman"/>
+                <w:b w:val="0"/>
+                <w:i w:val="0"/>
+                <w:color w:val="000000"/>
+                <w:sz w:val="20"/>
+              </w:rPr>
+              <w:t>37</w:t>
+            </w:r>
+          </w:p>
+        </w:tc>
+        <w:tc>
+          <w:tcPr>
+            <w:tcW w:type="dxa" w:w="1289"/>
+          </w:tcPr>
+          <w:p>
+            <w:pPr>
+              <w:spacing w:line="240" w:lineRule="auto" w:after="40" w:before="0"/>
+              <w:jc w:val="center"/>
+            </w:pPr>
+            <w:r>
+              <w:rPr>
+                <w:rFonts w:ascii="Times New Roman" w:hAnsi="Times New Roman" w:cs="Times New Roman"/>
+                <w:b w:val="0"/>
+                <w:i w:val="0"/>
+                <w:color w:val="000000"/>
+                <w:sz w:val="20"/>
+              </w:rPr>
+              <w:t>39.0</w:t>
+            </w:r>
+          </w:p>
+        </w:tc>
+        <w:tc>
+          <w:tcPr>
+            <w:tcW w:type="dxa" w:w="1289"/>
+          </w:tcPr>
+          <w:p>
+            <w:pPr>
+              <w:spacing w:line="240" w:lineRule="auto" w:after="40" w:before="0"/>
+              <w:jc w:val="center"/>
+            </w:pPr>
+            <w:r>
+              <w:rPr>
+                <w:rFonts w:ascii="Times New Roman" w:hAnsi="Times New Roman" w:cs="Times New Roman"/>
+                <w:b w:val="0"/>
+                <w:i w:val="0"/>
+                <w:color w:val="000000"/>
+                <w:sz w:val="20"/>
+              </w:rPr>
+              <w:t>33.00</w:t>
+            </w:r>
+          </w:p>
+        </w:tc>
+        <w:tc>
+          <w:tcPr>
+            <w:tcW w:type="dxa" w:w="1289"/>
+          </w:tcPr>
+          <w:p>
+            <w:pPr>
+              <w:spacing w:line="240" w:lineRule="auto" w:after="40" w:before="0"/>
+              <w:jc w:val="center"/>
+            </w:pPr>
+            <w:r>
+              <w:rPr>
+                <w:rFonts w:ascii="Times New Roman" w:hAnsi="Times New Roman" w:cs="Times New Roman"/>
+                <w:b w:val="0"/>
+                <w:i w:val="0"/>
+                <w:color w:val="000000"/>
+                <w:sz w:val="20"/>
+              </w:rPr>
+              <w:t>43.00</w:t>
+            </w:r>
+          </w:p>
+        </w:tc>
+        <w:tc>
+          <w:tcPr>
+            <w:tcW w:type="dxa" w:w="1289"/>
+          </w:tcPr>
+          <w:p>
+            <w:pPr>
+              <w:spacing w:line="240" w:lineRule="auto" w:after="40" w:before="0"/>
+              <w:jc w:val="center"/>
+            </w:pPr>
+            <w:r>
+              <w:rPr>
+                <w:rFonts w:ascii="Times New Roman" w:hAnsi="Times New Roman" w:cs="Times New Roman"/>
+                <w:b w:val="0"/>
+                <w:i w:val="0"/>
+                <w:color w:val="000000"/>
+                <w:sz w:val="20"/>
+              </w:rPr>
+              <w:t>39.62</w:t>
+            </w:r>
+          </w:p>
+        </w:tc>
+        <w:tc>
+          <w:tcPr>
+            <w:tcW w:type="dxa" w:w="1289"/>
+          </w:tcPr>
+          <w:p>
+            <w:pPr>
+              <w:spacing w:line="240" w:lineRule="auto" w:after="40" w:before="0"/>
+              <w:jc w:val="center"/>
+            </w:pPr>
+            <w:r>
+              <w:rPr>
+                <w:rFonts w:ascii="Times New Roman" w:hAnsi="Times New Roman" w:cs="Times New Roman"/>
+                <w:b w:val="0"/>
+                <w:i w:val="0"/>
+                <w:color w:val="000000"/>
+                <w:sz w:val="20"/>
+              </w:rPr>
+              <w:t>8.86</w:t>
+            </w:r>
+          </w:p>
+        </w:tc>
+      </w:tr>
+      <w:tr>
+        <w:tc>
+          <w:tcPr>
+            <w:tcW w:type="dxa" w:w="1289"/>
+          </w:tcPr>
+          <w:p>
+            <w:pPr>
+              <w:spacing w:line="240" w:lineRule="auto" w:after="40" w:before="0"/>
+              <w:jc w:val="center"/>
+            </w:pPr>
+            <w:r>
+              <w:rPr>
+                <w:rFonts w:ascii="Times New Roman" w:hAnsi="Times New Roman" w:cs="Times New Roman"/>
+                <w:b w:val="0"/>
+                <w:i w:val="0"/>
+                <w:color w:val="000000"/>
+                <w:sz w:val="20"/>
+              </w:rPr>
+              <w:t>Physical activity guidelines</w:t>
+            </w:r>
+          </w:p>
+        </w:tc>
+        <w:tc>
+          <w:tcPr>
+            <w:tcW w:type="dxa" w:w="1289"/>
+          </w:tcPr>
+          <w:p>
+            <w:pPr>
+              <w:spacing w:line="240" w:lineRule="auto" w:after="40" w:before="0"/>
+              <w:jc w:val="center"/>
+            </w:pPr>
+            <w:r>
+              <w:rPr>
+                <w:rFonts w:ascii="Times New Roman" w:hAnsi="Times New Roman" w:cs="Times New Roman"/>
+                <w:b w:val="0"/>
+                <w:i w:val="0"/>
+                <w:color w:val="000000"/>
+                <w:sz w:val="20"/>
+              </w:rPr>
+              <w:t>40</w:t>
+            </w:r>
+          </w:p>
+        </w:tc>
+        <w:tc>
+          <w:tcPr>
+            <w:tcW w:type="dxa" w:w="1289"/>
+          </w:tcPr>
+          <w:p>
+            <w:pPr>
+              <w:spacing w:line="240" w:lineRule="auto" w:after="40" w:before="0"/>
+              <w:jc w:val="center"/>
+            </w:pPr>
+            <w:r>
+              <w:rPr>
+                <w:rFonts w:ascii="Times New Roman" w:hAnsi="Times New Roman" w:cs="Times New Roman"/>
+                <w:b w:val="0"/>
+                <w:i w:val="0"/>
+                <w:color w:val="000000"/>
+                <w:sz w:val="20"/>
+              </w:rPr>
+              <w:t>39.5</w:t>
+            </w:r>
+          </w:p>
+        </w:tc>
+        <w:tc>
+          <w:tcPr>
+            <w:tcW w:type="dxa" w:w="1289"/>
+          </w:tcPr>
+          <w:p>
+            <w:pPr>
+              <w:spacing w:line="240" w:lineRule="auto" w:after="40" w:before="0"/>
+              <w:jc w:val="center"/>
+            </w:pPr>
+            <w:r>
+              <w:rPr>
+                <w:rFonts w:ascii="Times New Roman" w:hAnsi="Times New Roman" w:cs="Times New Roman"/>
+                <w:b w:val="0"/>
+                <w:i w:val="0"/>
+                <w:color w:val="000000"/>
+                <w:sz w:val="20"/>
+              </w:rPr>
+              <w:t>32.00</w:t>
+            </w:r>
+          </w:p>
+        </w:tc>
+        <w:tc>
+          <w:tcPr>
+            <w:tcW w:type="dxa" w:w="1289"/>
+          </w:tcPr>
+          <w:p>
+            <w:pPr>
+              <w:spacing w:line="240" w:lineRule="auto" w:after="40" w:before="0"/>
+              <w:jc w:val="center"/>
+            </w:pPr>
+            <w:r>
+              <w:rPr>
+                <w:rFonts w:ascii="Times New Roman" w:hAnsi="Times New Roman" w:cs="Times New Roman"/>
+                <w:b w:val="0"/>
+                <w:i w:val="0"/>
+                <w:color w:val="000000"/>
+                <w:sz w:val="20"/>
+              </w:rPr>
+              <w:t>51.00</w:t>
+            </w:r>
+          </w:p>
+        </w:tc>
+        <w:tc>
+          <w:tcPr>
+            <w:tcW w:type="dxa" w:w="1289"/>
+          </w:tcPr>
+          <w:p>
+            <w:pPr>
+              <w:spacing w:line="240" w:lineRule="auto" w:after="40" w:before="0"/>
+              <w:jc w:val="center"/>
+            </w:pPr>
+            <w:r>
+              <w:rPr>
+                <w:rFonts w:ascii="Times New Roman" w:hAnsi="Times New Roman" w:cs="Times New Roman"/>
+                <w:b w:val="0"/>
+                <w:i w:val="0"/>
+                <w:color w:val="000000"/>
+                <w:sz w:val="20"/>
+              </w:rPr>
+              <w:t>40.70</w:t>
+            </w:r>
+          </w:p>
+        </w:tc>
+        <w:tc>
+          <w:tcPr>
+            <w:tcW w:type="dxa" w:w="1289"/>
+          </w:tcPr>
+          <w:p>
+            <w:pPr>
+              <w:spacing w:line="240" w:lineRule="auto" w:after="40" w:before="0"/>
+              <w:jc w:val="center"/>
+            </w:pPr>
+            <w:r>
+              <w:rPr>
+                <w:rFonts w:ascii="Times New Roman" w:hAnsi="Times New Roman" w:cs="Times New Roman"/>
+                <w:b w:val="0"/>
+                <w:i w:val="0"/>
+                <w:color w:val="000000"/>
+                <w:sz w:val="20"/>
+              </w:rPr>
+              <w:t>11.23</w:t>
+            </w:r>
+          </w:p>
+        </w:tc>
+      </w:tr>
+      <w:tr>
+        <w:tc>
+          <w:tcPr>
+            <w:tcW w:type="dxa" w:w="1289"/>
+          </w:tcPr>
+          <w:p>
+            <w:pPr>
+              <w:spacing w:line="240" w:lineRule="auto" w:after="40" w:before="0"/>
+              <w:jc w:val="center"/>
+            </w:pPr>
+            <w:r>
+              <w:rPr>
+                <w:rFonts w:ascii="Times New Roman" w:hAnsi="Times New Roman" w:cs="Times New Roman"/>
+                <w:b w:val="0"/>
+                <w:i w:val="0"/>
+                <w:color w:val="000000"/>
+                <w:sz w:val="20"/>
+              </w:rPr>
+              <w:t>Home workout routine</w:t>
+            </w:r>
+          </w:p>
+        </w:tc>
+        <w:tc>
+          <w:tcPr>
+            <w:tcW w:type="dxa" w:w="1289"/>
+          </w:tcPr>
+          <w:p>
+            <w:pPr>
+              <w:spacing w:line="240" w:lineRule="auto" w:after="40" w:before="0"/>
+              <w:jc w:val="center"/>
+            </w:pPr>
+            <w:r>
+              <w:rPr>
+                <w:rFonts w:ascii="Times New Roman" w:hAnsi="Times New Roman" w:cs="Times New Roman"/>
+                <w:b w:val="0"/>
+                <w:i w:val="0"/>
+                <w:color w:val="000000"/>
+                <w:sz w:val="20"/>
+              </w:rPr>
+              <w:t>40</w:t>
+            </w:r>
+          </w:p>
+        </w:tc>
+        <w:tc>
+          <w:tcPr>
+            <w:tcW w:type="dxa" w:w="1289"/>
+          </w:tcPr>
+          <w:p>
+            <w:pPr>
+              <w:spacing w:line="240" w:lineRule="auto" w:after="40" w:before="0"/>
+              <w:jc w:val="center"/>
+            </w:pPr>
+            <w:r>
+              <w:rPr>
+                <w:rFonts w:ascii="Times New Roman" w:hAnsi="Times New Roman" w:cs="Times New Roman"/>
+                <w:b w:val="0"/>
+                <w:i w:val="0"/>
+                <w:color w:val="000000"/>
+                <w:sz w:val="20"/>
+              </w:rPr>
+              <w:t>34.0</w:t>
+            </w:r>
+          </w:p>
+        </w:tc>
+        <w:tc>
+          <w:tcPr>
+            <w:tcW w:type="dxa" w:w="1289"/>
+          </w:tcPr>
+          <w:p>
+            <w:pPr>
+              <w:spacing w:line="240" w:lineRule="auto" w:after="40" w:before="0"/>
+              <w:jc w:val="center"/>
+            </w:pPr>
+            <w:r>
+              <w:rPr>
+                <w:rFonts w:ascii="Times New Roman" w:hAnsi="Times New Roman" w:cs="Times New Roman"/>
+                <w:b w:val="0"/>
+                <w:i w:val="0"/>
+                <w:color w:val="000000"/>
+                <w:sz w:val="20"/>
+              </w:rPr>
+              <w:t>25.00</w:t>
+            </w:r>
+          </w:p>
+        </w:tc>
+        <w:tc>
+          <w:tcPr>
+            <w:tcW w:type="dxa" w:w="1289"/>
+          </w:tcPr>
+          <w:p>
+            <w:pPr>
+              <w:spacing w:line="240" w:lineRule="auto" w:after="40" w:before="0"/>
+              <w:jc w:val="center"/>
+            </w:pPr>
+            <w:r>
+              <w:rPr>
+                <w:rFonts w:ascii="Times New Roman" w:hAnsi="Times New Roman" w:cs="Times New Roman"/>
+                <w:b w:val="0"/>
+                <w:i w:val="0"/>
+                <w:color w:val="000000"/>
+                <w:sz w:val="20"/>
+              </w:rPr>
+              <w:t>38.00</w:t>
+            </w:r>
+          </w:p>
+        </w:tc>
+        <w:tc>
+          <w:tcPr>
+            <w:tcW w:type="dxa" w:w="1289"/>
+          </w:tcPr>
+          <w:p>
+            <w:pPr>
+              <w:spacing w:line="240" w:lineRule="auto" w:after="40" w:before="0"/>
+              <w:jc w:val="center"/>
+            </w:pPr>
+            <w:r>
+              <w:rPr>
+                <w:rFonts w:ascii="Times New Roman" w:hAnsi="Times New Roman" w:cs="Times New Roman"/>
+                <w:b w:val="0"/>
+                <w:i w:val="0"/>
+                <w:color w:val="000000"/>
+                <w:sz w:val="20"/>
+              </w:rPr>
+              <w:t>32.60</w:t>
+            </w:r>
+          </w:p>
+        </w:tc>
+        <w:tc>
+          <w:tcPr>
+            <w:tcW w:type="dxa" w:w="1289"/>
+          </w:tcPr>
+          <w:p>
+            <w:pPr>
+              <w:spacing w:line="240" w:lineRule="auto" w:after="40" w:before="0"/>
+              <w:jc w:val="center"/>
+            </w:pPr>
+            <w:r>
+              <w:rPr>
+                <w:rFonts w:ascii="Times New Roman" w:hAnsi="Times New Roman" w:cs="Times New Roman"/>
+                <w:b w:val="0"/>
+                <w:i w:val="0"/>
+                <w:color w:val="000000"/>
+                <w:sz w:val="20"/>
+              </w:rPr>
+              <w:t>8.52</w:t>
+            </w:r>
+          </w:p>
+        </w:tc>
+      </w:tr>
+    </w:tbl>
+    <w:p>
+      <w:pPr>
+        <w:spacing w:line="360" w:lineRule="auto" w:after="120" w:before="0"/>
+        <w:jc w:val="both"/>
+      </w:pPr>
+      <w:r>
+        <w:rPr>
+          <w:rFonts w:ascii="Times New Roman" w:hAnsi="Times New Roman" w:cs="Times New Roman"/>
+          <w:b w:val="0"/>
+          <w:i w:val="0"/>
+          <w:color w:val="000000"/>
+          <w:sz w:val="24"/>
+        </w:rPr>
+        <w:t>Note. Kruskal-Wallis H(4) = 27.255, p &lt; .001. n values reflect the final audited sample (N = 197); exact counts per search term vary slightly due to TikTok audit exclusions.</w:t>
+      </w:r>
+    </w:p>
     <w:sectPr>
       <w:pgSz w:w="11906" w:h="16838"/>
       <w:pgMar w:top="1440" w:right="1440" w:bottom="1440" w:left="1440" w:header="720" w:footer="720" w:gutter="0"/>

</xml_diff>

<commit_message>
fix thesis formatting and appendix image assembly
</commit_message>
<xml_diff>
--- a/appendices/appendix_c_data_summary.docx
+++ b/appendices/appendix_c_data_summary.docx
@@ -7521,14 +7521,14 @@
     <w:pPr>
       <w:keepNext/>
       <w:keepLines/>
-      <w:spacing w:before="480" w:after="0"/>
+      <w:spacing w:before="480" w:after="0" w:line="360" w:lineRule="auto"/>
       <w:outlineLvl w:val="0"/>
     </w:pPr>
     <w:rPr>
-      <w:rFonts w:asciiTheme="majorHAnsi" w:eastAsiaTheme="majorEastAsia" w:hAnsiTheme="majorHAnsi" w:cstheme="majorBidi"/>
+      <w:rFonts w:asciiTheme="majorHAnsi" w:eastAsiaTheme="majorEastAsia" w:hAnsiTheme="majorHAnsi" w:cstheme="majorBidi" w:ascii="Times New Roman" w:hAnsi="Times New Roman"/>
       <w:b/>
       <w:bCs/>
-      <w:color w:val="365F91" w:themeColor="accent1" w:themeShade="BF"/>
+      <w:color w:val="000000"/>
       <w:sz w:val="28"/>
       <w:szCs w:val="28"/>
     </w:rPr>
@@ -7545,15 +7545,15 @@
     <w:pPr>
       <w:keepNext/>
       <w:keepLines/>
-      <w:spacing w:before="200" w:after="0"/>
+      <w:spacing w:before="200" w:after="0" w:line="360" w:lineRule="auto"/>
       <w:outlineLvl w:val="1"/>
     </w:pPr>
     <w:rPr>
-      <w:rFonts w:asciiTheme="majorHAnsi" w:eastAsiaTheme="majorEastAsia" w:hAnsiTheme="majorHAnsi" w:cstheme="majorBidi"/>
+      <w:rFonts w:asciiTheme="majorHAnsi" w:eastAsiaTheme="majorEastAsia" w:hAnsiTheme="majorHAnsi" w:cstheme="majorBidi" w:ascii="Times New Roman" w:hAnsi="Times New Roman"/>
       <w:b/>
       <w:bCs/>
-      <w:color w:val="4F81BD" w:themeColor="accent1"/>
-      <w:sz w:val="26"/>
+      <w:color w:val="000000"/>
+      <w:sz w:val="24"/>
       <w:szCs w:val="26"/>
     </w:rPr>
   </w:style>
@@ -7569,14 +7569,15 @@
     <w:pPr>
       <w:keepNext/>
       <w:keepLines/>
-      <w:spacing w:before="200" w:after="0"/>
+      <w:spacing w:before="200" w:after="0" w:line="360" w:lineRule="auto"/>
       <w:outlineLvl w:val="2"/>
     </w:pPr>
     <w:rPr>
-      <w:rFonts w:asciiTheme="majorHAnsi" w:eastAsiaTheme="majorEastAsia" w:hAnsiTheme="majorHAnsi" w:cstheme="majorBidi"/>
+      <w:rFonts w:asciiTheme="majorHAnsi" w:eastAsiaTheme="majorEastAsia" w:hAnsiTheme="majorHAnsi" w:cstheme="majorBidi" w:ascii="Times New Roman" w:hAnsi="Times New Roman"/>
       <w:b/>
       <w:bCs/>
-      <w:color w:val="4F81BD" w:themeColor="accent1"/>
+      <w:color w:val="000000"/>
+      <w:sz w:val="24"/>
     </w:rPr>
   </w:style>
   <w:style w:type="paragraph" w:styleId="Heading4">

</xml_diff>